<commit_message>
change in the document format
</commit_message>
<xml_diff>
--- a/docs/assignment 1 task 1 (Smart Pantry) BIT 216.docx
+++ b/docs/assignment 1 task 1 (Smart Pantry) BIT 216.docx
@@ -254,7 +254,7 @@
               <w:tab w:val="right" w:leader="dot" w:pos="9016"/>
             </w:tabs>
             <w:rPr>
-              <w:rFonts w:eastAsiaTheme="minorEastAsia" w:cstheme="minorBidi"/>
+              <w:rFonts w:ascii="Times New Roman" w:eastAsiaTheme="minorEastAsia" w:hAnsi="Times New Roman" w:cs="Times New Roman"/>
               <w:noProof/>
               <w:sz w:val="24"/>
               <w:szCs w:val="30"/>
@@ -285,13 +285,14 @@
             <w:r>
               <w:rPr>
                 <w:rStyle w:val="Hyperlink"/>
-                <w:rFonts w:ascii="Times New Roman" w:hAnsi="Times New Roman"/>
+                <w:rFonts w:ascii="Times New Roman" w:hAnsi="Times New Roman" w:cs="Times New Roman"/>
                 <w:noProof/>
               </w:rPr>
               <w:t>1.0  Overview</w:t>
             </w:r>
             <w:r>
               <w:rPr>
+                <w:rFonts w:ascii="Times New Roman" w:hAnsi="Times New Roman" w:cs="Times New Roman"/>
                 <w:noProof/>
                 <w:webHidden/>
               </w:rPr>
@@ -299,6 +300,7 @@
             </w:r>
             <w:r>
               <w:rPr>
+                <w:rFonts w:ascii="Times New Roman" w:hAnsi="Times New Roman" w:cs="Times New Roman"/>
                 <w:noProof/>
                 <w:webHidden/>
               </w:rPr>
@@ -306,6 +308,7 @@
             </w:r>
             <w:r>
               <w:rPr>
+                <w:rFonts w:ascii="Times New Roman" w:hAnsi="Times New Roman" w:cs="Times New Roman"/>
                 <w:noProof/>
                 <w:webHidden/>
               </w:rPr>
@@ -313,12 +316,14 @@
             </w:r>
             <w:r>
               <w:rPr>
+                <w:rFonts w:ascii="Times New Roman" w:hAnsi="Times New Roman" w:cs="Times New Roman"/>
                 <w:noProof/>
                 <w:webHidden/>
               </w:rPr>
             </w:r>
             <w:r>
               <w:rPr>
+                <w:rFonts w:ascii="Times New Roman" w:hAnsi="Times New Roman" w:cs="Times New Roman"/>
                 <w:noProof/>
                 <w:webHidden/>
               </w:rPr>
@@ -326,6 +331,7 @@
             </w:r>
             <w:r>
               <w:rPr>
+                <w:rFonts w:ascii="Times New Roman" w:hAnsi="Times New Roman" w:cs="Times New Roman"/>
                 <w:noProof/>
                 <w:webHidden/>
               </w:rPr>
@@ -333,6 +339,7 @@
             </w:r>
             <w:r>
               <w:rPr>
+                <w:rFonts w:ascii="Times New Roman" w:hAnsi="Times New Roman" w:cs="Times New Roman"/>
                 <w:noProof/>
                 <w:webHidden/>
               </w:rPr>
@@ -347,7 +354,7 @@
               <w:tab w:val="right" w:leader="dot" w:pos="9016"/>
             </w:tabs>
             <w:rPr>
-              <w:rFonts w:eastAsiaTheme="minorEastAsia" w:cstheme="minorBidi"/>
+              <w:rFonts w:ascii="Times New Roman" w:eastAsiaTheme="minorEastAsia" w:hAnsi="Times New Roman" w:cs="Times New Roman"/>
               <w:noProof/>
               <w:sz w:val="24"/>
               <w:szCs w:val="30"/>
@@ -357,13 +364,14 @@
             <w:r>
               <w:rPr>
                 <w:rStyle w:val="Hyperlink"/>
-                <w:rFonts w:ascii="Times New Roman" w:hAnsi="Times New Roman"/>
+                <w:rFonts w:ascii="Times New Roman" w:hAnsi="Times New Roman" w:cs="Times New Roman"/>
                 <w:noProof/>
               </w:rPr>
               <w:t>2.0  Project Aims</w:t>
             </w:r>
             <w:r>
               <w:rPr>
+                <w:rFonts w:ascii="Times New Roman" w:hAnsi="Times New Roman" w:cs="Times New Roman"/>
                 <w:noProof/>
                 <w:webHidden/>
               </w:rPr>
@@ -371,6 +379,7 @@
             </w:r>
             <w:r>
               <w:rPr>
+                <w:rFonts w:ascii="Times New Roman" w:hAnsi="Times New Roman" w:cs="Times New Roman"/>
                 <w:noProof/>
                 <w:webHidden/>
               </w:rPr>
@@ -378,6 +387,7 @@
             </w:r>
             <w:r>
               <w:rPr>
+                <w:rFonts w:ascii="Times New Roman" w:hAnsi="Times New Roman" w:cs="Times New Roman"/>
                 <w:noProof/>
                 <w:webHidden/>
               </w:rPr>
@@ -385,12 +395,14 @@
             </w:r>
             <w:r>
               <w:rPr>
+                <w:rFonts w:ascii="Times New Roman" w:hAnsi="Times New Roman" w:cs="Times New Roman"/>
                 <w:noProof/>
                 <w:webHidden/>
               </w:rPr>
             </w:r>
             <w:r>
               <w:rPr>
+                <w:rFonts w:ascii="Times New Roman" w:hAnsi="Times New Roman" w:cs="Times New Roman"/>
                 <w:noProof/>
                 <w:webHidden/>
               </w:rPr>
@@ -398,6 +410,7 @@
             </w:r>
             <w:r>
               <w:rPr>
+                <w:rFonts w:ascii="Times New Roman" w:hAnsi="Times New Roman" w:cs="Times New Roman"/>
                 <w:noProof/>
                 <w:webHidden/>
               </w:rPr>
@@ -405,6 +418,7 @@
             </w:r>
             <w:r>
               <w:rPr>
+                <w:rFonts w:ascii="Times New Roman" w:hAnsi="Times New Roman" w:cs="Times New Roman"/>
                 <w:noProof/>
                 <w:webHidden/>
               </w:rPr>
@@ -419,7 +433,7 @@
               <w:tab w:val="right" w:leader="dot" w:pos="9016"/>
             </w:tabs>
             <w:rPr>
-              <w:rFonts w:eastAsiaTheme="minorEastAsia" w:cstheme="minorBidi"/>
+              <w:rFonts w:ascii="Times New Roman" w:eastAsiaTheme="minorEastAsia" w:hAnsi="Times New Roman" w:cs="Times New Roman"/>
               <w:noProof/>
               <w:sz w:val="24"/>
               <w:szCs w:val="30"/>
@@ -429,13 +443,14 @@
             <w:r>
               <w:rPr>
                 <w:rStyle w:val="Hyperlink"/>
-                <w:rFonts w:ascii="Times New Roman" w:hAnsi="Times New Roman"/>
+                <w:rFonts w:ascii="Times New Roman" w:hAnsi="Times New Roman" w:cs="Times New Roman"/>
                 <w:noProof/>
               </w:rPr>
               <w:t>3.0  Project Objectives</w:t>
             </w:r>
             <w:r>
               <w:rPr>
+                <w:rFonts w:ascii="Times New Roman" w:hAnsi="Times New Roman" w:cs="Times New Roman"/>
                 <w:noProof/>
                 <w:webHidden/>
               </w:rPr>
@@ -443,6 +458,7 @@
             </w:r>
             <w:r>
               <w:rPr>
+                <w:rFonts w:ascii="Times New Roman" w:hAnsi="Times New Roman" w:cs="Times New Roman"/>
                 <w:noProof/>
                 <w:webHidden/>
               </w:rPr>
@@ -450,6 +466,7 @@
             </w:r>
             <w:r>
               <w:rPr>
+                <w:rFonts w:ascii="Times New Roman" w:hAnsi="Times New Roman" w:cs="Times New Roman"/>
                 <w:noProof/>
                 <w:webHidden/>
               </w:rPr>
@@ -457,12 +474,14 @@
             </w:r>
             <w:r>
               <w:rPr>
+                <w:rFonts w:ascii="Times New Roman" w:hAnsi="Times New Roman" w:cs="Times New Roman"/>
                 <w:noProof/>
                 <w:webHidden/>
               </w:rPr>
             </w:r>
             <w:r>
               <w:rPr>
+                <w:rFonts w:ascii="Times New Roman" w:hAnsi="Times New Roman" w:cs="Times New Roman"/>
                 <w:noProof/>
                 <w:webHidden/>
               </w:rPr>
@@ -470,6 +489,7 @@
             </w:r>
             <w:r>
               <w:rPr>
+                <w:rFonts w:ascii="Times New Roman" w:hAnsi="Times New Roman" w:cs="Times New Roman"/>
                 <w:noProof/>
                 <w:webHidden/>
               </w:rPr>
@@ -477,6 +497,7 @@
             </w:r>
             <w:r>
               <w:rPr>
+                <w:rFonts w:ascii="Times New Roman" w:hAnsi="Times New Roman" w:cs="Times New Roman"/>
                 <w:noProof/>
                 <w:webHidden/>
               </w:rPr>
@@ -491,7 +512,7 @@
               <w:tab w:val="right" w:leader="dot" w:pos="9016"/>
             </w:tabs>
             <w:rPr>
-              <w:rFonts w:eastAsiaTheme="minorEastAsia" w:cstheme="minorBidi"/>
+              <w:rFonts w:ascii="Times New Roman" w:eastAsiaTheme="minorEastAsia" w:hAnsi="Times New Roman" w:cs="Times New Roman"/>
               <w:noProof/>
               <w:sz w:val="24"/>
               <w:szCs w:val="30"/>
@@ -501,13 +522,14 @@
             <w:r>
               <w:rPr>
                 <w:rStyle w:val="Hyperlink"/>
-                <w:rFonts w:ascii="Times New Roman" w:hAnsi="Times New Roman"/>
+                <w:rFonts w:ascii="Times New Roman" w:hAnsi="Times New Roman" w:cs="Times New Roman"/>
                 <w:noProof/>
               </w:rPr>
               <w:t>4.0  Project Scope</w:t>
             </w:r>
             <w:r>
               <w:rPr>
+                <w:rFonts w:ascii="Times New Roman" w:hAnsi="Times New Roman" w:cs="Times New Roman"/>
                 <w:noProof/>
                 <w:webHidden/>
               </w:rPr>
@@ -515,6 +537,7 @@
             </w:r>
             <w:r>
               <w:rPr>
+                <w:rFonts w:ascii="Times New Roman" w:hAnsi="Times New Roman" w:cs="Times New Roman"/>
                 <w:noProof/>
                 <w:webHidden/>
               </w:rPr>
@@ -522,6 +545,7 @@
             </w:r>
             <w:r>
               <w:rPr>
+                <w:rFonts w:ascii="Times New Roman" w:hAnsi="Times New Roman" w:cs="Times New Roman"/>
                 <w:noProof/>
                 <w:webHidden/>
               </w:rPr>
@@ -529,12 +553,14 @@
             </w:r>
             <w:r>
               <w:rPr>
+                <w:rFonts w:ascii="Times New Roman" w:hAnsi="Times New Roman" w:cs="Times New Roman"/>
                 <w:noProof/>
                 <w:webHidden/>
               </w:rPr>
             </w:r>
             <w:r>
               <w:rPr>
+                <w:rFonts w:ascii="Times New Roman" w:hAnsi="Times New Roman" w:cs="Times New Roman"/>
                 <w:noProof/>
                 <w:webHidden/>
               </w:rPr>
@@ -542,6 +568,7 @@
             </w:r>
             <w:r>
               <w:rPr>
+                <w:rFonts w:ascii="Times New Roman" w:hAnsi="Times New Roman" w:cs="Times New Roman"/>
                 <w:noProof/>
                 <w:webHidden/>
               </w:rPr>
@@ -549,6 +576,7 @@
             </w:r>
             <w:r>
               <w:rPr>
+                <w:rFonts w:ascii="Times New Roman" w:hAnsi="Times New Roman" w:cs="Times New Roman"/>
                 <w:noProof/>
                 <w:webHidden/>
               </w:rPr>
@@ -563,7 +591,7 @@
               <w:tab w:val="right" w:leader="dot" w:pos="9016"/>
             </w:tabs>
             <w:rPr>
-              <w:rFonts w:eastAsiaTheme="minorEastAsia" w:cstheme="minorBidi"/>
+              <w:rFonts w:ascii="Times New Roman" w:eastAsiaTheme="minorEastAsia" w:hAnsi="Times New Roman" w:cs="Times New Roman"/>
               <w:noProof/>
               <w:sz w:val="24"/>
               <w:szCs w:val="30"/>
@@ -573,13 +601,14 @@
             <w:r>
               <w:rPr>
                 <w:rStyle w:val="Hyperlink"/>
-                <w:rFonts w:ascii="Times New Roman" w:hAnsi="Times New Roman"/>
+                <w:rFonts w:ascii="Times New Roman" w:hAnsi="Times New Roman" w:cs="Times New Roman"/>
                 <w:noProof/>
               </w:rPr>
               <w:t>4.1  In Scope</w:t>
             </w:r>
             <w:r>
               <w:rPr>
+                <w:rFonts w:ascii="Times New Roman" w:hAnsi="Times New Roman" w:cs="Times New Roman"/>
                 <w:noProof/>
                 <w:webHidden/>
               </w:rPr>
@@ -587,6 +616,7 @@
             </w:r>
             <w:r>
               <w:rPr>
+                <w:rFonts w:ascii="Times New Roman" w:hAnsi="Times New Roman" w:cs="Times New Roman"/>
                 <w:noProof/>
                 <w:webHidden/>
               </w:rPr>
@@ -594,6 +624,7 @@
             </w:r>
             <w:r>
               <w:rPr>
+                <w:rFonts w:ascii="Times New Roman" w:hAnsi="Times New Roman" w:cs="Times New Roman"/>
                 <w:noProof/>
                 <w:webHidden/>
               </w:rPr>
@@ -601,12 +632,14 @@
             </w:r>
             <w:r>
               <w:rPr>
+                <w:rFonts w:ascii="Times New Roman" w:hAnsi="Times New Roman" w:cs="Times New Roman"/>
                 <w:noProof/>
                 <w:webHidden/>
               </w:rPr>
             </w:r>
             <w:r>
               <w:rPr>
+                <w:rFonts w:ascii="Times New Roman" w:hAnsi="Times New Roman" w:cs="Times New Roman"/>
                 <w:noProof/>
                 <w:webHidden/>
               </w:rPr>
@@ -614,6 +647,7 @@
             </w:r>
             <w:r>
               <w:rPr>
+                <w:rFonts w:ascii="Times New Roman" w:hAnsi="Times New Roman" w:cs="Times New Roman"/>
                 <w:noProof/>
                 <w:webHidden/>
               </w:rPr>
@@ -621,6 +655,7 @@
             </w:r>
             <w:r>
               <w:rPr>
+                <w:rFonts w:ascii="Times New Roman" w:hAnsi="Times New Roman" w:cs="Times New Roman"/>
                 <w:noProof/>
                 <w:webHidden/>
               </w:rPr>
@@ -635,7 +670,7 @@
               <w:tab w:val="right" w:leader="dot" w:pos="9016"/>
             </w:tabs>
             <w:rPr>
-              <w:rFonts w:eastAsiaTheme="minorEastAsia" w:cstheme="minorBidi"/>
+              <w:rFonts w:ascii="Times New Roman" w:eastAsiaTheme="minorEastAsia" w:hAnsi="Times New Roman" w:cs="Times New Roman"/>
               <w:noProof/>
               <w:sz w:val="24"/>
               <w:szCs w:val="30"/>
@@ -645,13 +680,14 @@
             <w:r>
               <w:rPr>
                 <w:rStyle w:val="Hyperlink"/>
-                <w:rFonts w:ascii="Times New Roman" w:hAnsi="Times New Roman"/>
+                <w:rFonts w:ascii="Times New Roman" w:hAnsi="Times New Roman" w:cs="Times New Roman"/>
                 <w:noProof/>
               </w:rPr>
               <w:t>4.2  Out of Scope</w:t>
             </w:r>
             <w:r>
               <w:rPr>
+                <w:rFonts w:ascii="Times New Roman" w:hAnsi="Times New Roman" w:cs="Times New Roman"/>
                 <w:noProof/>
                 <w:webHidden/>
               </w:rPr>
@@ -659,6 +695,7 @@
             </w:r>
             <w:r>
               <w:rPr>
+                <w:rFonts w:ascii="Times New Roman" w:hAnsi="Times New Roman" w:cs="Times New Roman"/>
                 <w:noProof/>
                 <w:webHidden/>
               </w:rPr>
@@ -666,6 +703,7 @@
             </w:r>
             <w:r>
               <w:rPr>
+                <w:rFonts w:ascii="Times New Roman" w:hAnsi="Times New Roman" w:cs="Times New Roman"/>
                 <w:noProof/>
                 <w:webHidden/>
               </w:rPr>
@@ -673,12 +711,14 @@
             </w:r>
             <w:r>
               <w:rPr>
+                <w:rFonts w:ascii="Times New Roman" w:hAnsi="Times New Roman" w:cs="Times New Roman"/>
                 <w:noProof/>
                 <w:webHidden/>
               </w:rPr>
             </w:r>
             <w:r>
               <w:rPr>
+                <w:rFonts w:ascii="Times New Roman" w:hAnsi="Times New Roman" w:cs="Times New Roman"/>
                 <w:noProof/>
                 <w:webHidden/>
               </w:rPr>
@@ -686,6 +726,7 @@
             </w:r>
             <w:r>
               <w:rPr>
+                <w:rFonts w:ascii="Times New Roman" w:hAnsi="Times New Roman" w:cs="Times New Roman"/>
                 <w:noProof/>
                 <w:webHidden/>
               </w:rPr>
@@ -693,6 +734,7 @@
             </w:r>
             <w:r>
               <w:rPr>
+                <w:rFonts w:ascii="Times New Roman" w:hAnsi="Times New Roman" w:cs="Times New Roman"/>
                 <w:noProof/>
                 <w:webHidden/>
               </w:rPr>
@@ -707,7 +749,7 @@
               <w:tab w:val="right" w:leader="dot" w:pos="9016"/>
             </w:tabs>
             <w:rPr>
-              <w:rFonts w:eastAsiaTheme="minorEastAsia" w:cstheme="minorBidi"/>
+              <w:rFonts w:ascii="Times New Roman" w:eastAsiaTheme="minorEastAsia" w:hAnsi="Times New Roman" w:cs="Times New Roman"/>
               <w:noProof/>
               <w:sz w:val="24"/>
               <w:szCs w:val="30"/>
@@ -717,13 +759,14 @@
             <w:r>
               <w:rPr>
                 <w:rStyle w:val="Hyperlink"/>
-                <w:rFonts w:ascii="Times New Roman" w:hAnsi="Times New Roman"/>
+                <w:rFonts w:ascii="Times New Roman" w:hAnsi="Times New Roman" w:cs="Times New Roman"/>
                 <w:noProof/>
               </w:rPr>
               <w:t>5.0 Project Schedule</w:t>
             </w:r>
             <w:r>
               <w:rPr>
+                <w:rFonts w:ascii="Times New Roman" w:hAnsi="Times New Roman" w:cs="Times New Roman"/>
                 <w:noProof/>
                 <w:webHidden/>
               </w:rPr>
@@ -731,6 +774,7 @@
             </w:r>
             <w:r>
               <w:rPr>
+                <w:rFonts w:ascii="Times New Roman" w:hAnsi="Times New Roman" w:cs="Times New Roman"/>
                 <w:noProof/>
                 <w:webHidden/>
               </w:rPr>
@@ -738,6 +782,7 @@
             </w:r>
             <w:r>
               <w:rPr>
+                <w:rFonts w:ascii="Times New Roman" w:hAnsi="Times New Roman" w:cs="Times New Roman"/>
                 <w:noProof/>
                 <w:webHidden/>
               </w:rPr>
@@ -745,12 +790,14 @@
             </w:r>
             <w:r>
               <w:rPr>
+                <w:rFonts w:ascii="Times New Roman" w:hAnsi="Times New Roman" w:cs="Times New Roman"/>
                 <w:noProof/>
                 <w:webHidden/>
               </w:rPr>
             </w:r>
             <w:r>
               <w:rPr>
+                <w:rFonts w:ascii="Times New Roman" w:hAnsi="Times New Roman" w:cs="Times New Roman"/>
                 <w:noProof/>
                 <w:webHidden/>
               </w:rPr>
@@ -758,6 +805,7 @@
             </w:r>
             <w:r>
               <w:rPr>
+                <w:rFonts w:ascii="Times New Roman" w:hAnsi="Times New Roman" w:cs="Times New Roman"/>
                 <w:noProof/>
                 <w:webHidden/>
               </w:rPr>
@@ -765,6 +813,7 @@
             </w:r>
             <w:r>
               <w:rPr>
+                <w:rFonts w:ascii="Times New Roman" w:hAnsi="Times New Roman" w:cs="Times New Roman"/>
                 <w:noProof/>
                 <w:webHidden/>
               </w:rPr>
@@ -779,7 +828,7 @@
               <w:tab w:val="right" w:leader="dot" w:pos="9016"/>
             </w:tabs>
             <w:rPr>
-              <w:rFonts w:eastAsiaTheme="minorEastAsia" w:cstheme="minorBidi"/>
+              <w:rFonts w:ascii="Times New Roman" w:eastAsiaTheme="minorEastAsia" w:hAnsi="Times New Roman" w:cs="Times New Roman"/>
               <w:noProof/>
               <w:sz w:val="24"/>
               <w:szCs w:val="30"/>
@@ -789,13 +838,14 @@
             <w:r>
               <w:rPr>
                 <w:rStyle w:val="Hyperlink"/>
-                <w:rFonts w:ascii="Times New Roman" w:hAnsi="Times New Roman"/>
+                <w:rFonts w:ascii="Times New Roman" w:hAnsi="Times New Roman" w:cs="Times New Roman"/>
                 <w:noProof/>
               </w:rPr>
               <w:t>5.1 Work Breakdown Structure (WBS)</w:t>
             </w:r>
             <w:r>
               <w:rPr>
+                <w:rFonts w:ascii="Times New Roman" w:hAnsi="Times New Roman" w:cs="Times New Roman"/>
                 <w:noProof/>
                 <w:webHidden/>
               </w:rPr>
@@ -803,6 +853,7 @@
             </w:r>
             <w:r>
               <w:rPr>
+                <w:rFonts w:ascii="Times New Roman" w:hAnsi="Times New Roman" w:cs="Times New Roman"/>
                 <w:noProof/>
                 <w:webHidden/>
               </w:rPr>
@@ -810,6 +861,7 @@
             </w:r>
             <w:r>
               <w:rPr>
+                <w:rFonts w:ascii="Times New Roman" w:hAnsi="Times New Roman" w:cs="Times New Roman"/>
                 <w:noProof/>
                 <w:webHidden/>
               </w:rPr>
@@ -817,12 +869,14 @@
             </w:r>
             <w:r>
               <w:rPr>
+                <w:rFonts w:ascii="Times New Roman" w:hAnsi="Times New Roman" w:cs="Times New Roman"/>
                 <w:noProof/>
                 <w:webHidden/>
               </w:rPr>
             </w:r>
             <w:r>
               <w:rPr>
+                <w:rFonts w:ascii="Times New Roman" w:hAnsi="Times New Roman" w:cs="Times New Roman"/>
                 <w:noProof/>
                 <w:webHidden/>
               </w:rPr>
@@ -830,6 +884,7 @@
             </w:r>
             <w:r>
               <w:rPr>
+                <w:rFonts w:ascii="Times New Roman" w:hAnsi="Times New Roman" w:cs="Times New Roman"/>
                 <w:noProof/>
                 <w:webHidden/>
               </w:rPr>
@@ -837,6 +892,7 @@
             </w:r>
             <w:r>
               <w:rPr>
+                <w:rFonts w:ascii="Times New Roman" w:hAnsi="Times New Roman" w:cs="Times New Roman"/>
                 <w:noProof/>
                 <w:webHidden/>
               </w:rPr>
@@ -851,7 +907,7 @@
               <w:tab w:val="right" w:leader="dot" w:pos="9016"/>
             </w:tabs>
             <w:rPr>
-              <w:rFonts w:eastAsiaTheme="minorEastAsia" w:cstheme="minorBidi"/>
+              <w:rFonts w:ascii="Times New Roman" w:eastAsiaTheme="minorEastAsia" w:hAnsi="Times New Roman" w:cs="Times New Roman"/>
               <w:noProof/>
               <w:sz w:val="24"/>
               <w:szCs w:val="30"/>
@@ -861,13 +917,14 @@
             <w:r>
               <w:rPr>
                 <w:rStyle w:val="Hyperlink"/>
-                <w:rFonts w:ascii="Times New Roman" w:hAnsi="Times New Roman"/>
+                <w:rFonts w:ascii="Times New Roman" w:hAnsi="Times New Roman" w:cs="Times New Roman"/>
                 <w:noProof/>
               </w:rPr>
               <w:t>5.2 Milestone / Deliverable</w:t>
             </w:r>
             <w:r>
               <w:rPr>
+                <w:rFonts w:ascii="Times New Roman" w:hAnsi="Times New Roman" w:cs="Times New Roman"/>
                 <w:noProof/>
                 <w:webHidden/>
               </w:rPr>
@@ -875,6 +932,7 @@
             </w:r>
             <w:r>
               <w:rPr>
+                <w:rFonts w:ascii="Times New Roman" w:hAnsi="Times New Roman" w:cs="Times New Roman"/>
                 <w:noProof/>
                 <w:webHidden/>
               </w:rPr>
@@ -882,6 +940,7 @@
             </w:r>
             <w:r>
               <w:rPr>
+                <w:rFonts w:ascii="Times New Roman" w:hAnsi="Times New Roman" w:cs="Times New Roman"/>
                 <w:noProof/>
                 <w:webHidden/>
               </w:rPr>
@@ -889,12 +948,14 @@
             </w:r>
             <w:r>
               <w:rPr>
+                <w:rFonts w:ascii="Times New Roman" w:hAnsi="Times New Roman" w:cs="Times New Roman"/>
                 <w:noProof/>
                 <w:webHidden/>
               </w:rPr>
             </w:r>
             <w:r>
               <w:rPr>
+                <w:rFonts w:ascii="Times New Roman" w:hAnsi="Times New Roman" w:cs="Times New Roman"/>
                 <w:noProof/>
                 <w:webHidden/>
               </w:rPr>
@@ -902,6 +963,7 @@
             </w:r>
             <w:r>
               <w:rPr>
+                <w:rFonts w:ascii="Times New Roman" w:hAnsi="Times New Roman" w:cs="Times New Roman"/>
                 <w:noProof/>
                 <w:webHidden/>
               </w:rPr>
@@ -909,6 +971,7 @@
             </w:r>
             <w:r>
               <w:rPr>
+                <w:rFonts w:ascii="Times New Roman" w:hAnsi="Times New Roman" w:cs="Times New Roman"/>
                 <w:noProof/>
                 <w:webHidden/>
               </w:rPr>
@@ -923,7 +986,7 @@
               <w:tab w:val="right" w:leader="dot" w:pos="9016"/>
             </w:tabs>
             <w:rPr>
-              <w:rFonts w:eastAsiaTheme="minorEastAsia" w:cstheme="minorBidi"/>
+              <w:rFonts w:ascii="Times New Roman" w:eastAsiaTheme="minorEastAsia" w:hAnsi="Times New Roman" w:cs="Times New Roman"/>
               <w:noProof/>
               <w:sz w:val="24"/>
               <w:szCs w:val="30"/>
@@ -933,13 +996,14 @@
             <w:r>
               <w:rPr>
                 <w:rStyle w:val="Hyperlink"/>
-                <w:rFonts w:ascii="Times New Roman" w:hAnsi="Times New Roman"/>
+                <w:rFonts w:ascii="Times New Roman" w:hAnsi="Times New Roman" w:cs="Times New Roman"/>
                 <w:noProof/>
               </w:rPr>
               <w:t>5.3 Gantt Chart</w:t>
             </w:r>
             <w:r>
               <w:rPr>
+                <w:rFonts w:ascii="Times New Roman" w:hAnsi="Times New Roman" w:cs="Times New Roman"/>
                 <w:noProof/>
                 <w:webHidden/>
               </w:rPr>
@@ -947,6 +1011,7 @@
             </w:r>
             <w:r>
               <w:rPr>
+                <w:rFonts w:ascii="Times New Roman" w:hAnsi="Times New Roman" w:cs="Times New Roman"/>
                 <w:noProof/>
                 <w:webHidden/>
               </w:rPr>
@@ -954,6 +1019,7 @@
             </w:r>
             <w:r>
               <w:rPr>
+                <w:rFonts w:ascii="Times New Roman" w:hAnsi="Times New Roman" w:cs="Times New Roman"/>
                 <w:noProof/>
                 <w:webHidden/>
               </w:rPr>
@@ -961,12 +1027,14 @@
             </w:r>
             <w:r>
               <w:rPr>
+                <w:rFonts w:ascii="Times New Roman" w:hAnsi="Times New Roman" w:cs="Times New Roman"/>
                 <w:noProof/>
                 <w:webHidden/>
               </w:rPr>
             </w:r>
             <w:r>
               <w:rPr>
+                <w:rFonts w:ascii="Times New Roman" w:hAnsi="Times New Roman" w:cs="Times New Roman"/>
                 <w:noProof/>
                 <w:webHidden/>
               </w:rPr>
@@ -974,6 +1042,7 @@
             </w:r>
             <w:r>
               <w:rPr>
+                <w:rFonts w:ascii="Times New Roman" w:hAnsi="Times New Roman" w:cs="Times New Roman"/>
                 <w:noProof/>
                 <w:webHidden/>
               </w:rPr>
@@ -981,6 +1050,7 @@
             </w:r>
             <w:r>
               <w:rPr>
+                <w:rFonts w:ascii="Times New Roman" w:hAnsi="Times New Roman" w:cs="Times New Roman"/>
                 <w:noProof/>
                 <w:webHidden/>
               </w:rPr>
@@ -995,7 +1065,7 @@
               <w:tab w:val="right" w:leader="dot" w:pos="9016"/>
             </w:tabs>
             <w:rPr>
-              <w:rFonts w:eastAsiaTheme="minorEastAsia" w:cstheme="minorBidi"/>
+              <w:rFonts w:ascii="Times New Roman" w:eastAsiaTheme="minorEastAsia" w:hAnsi="Times New Roman" w:cs="Times New Roman"/>
               <w:noProof/>
               <w:sz w:val="24"/>
               <w:szCs w:val="30"/>
@@ -1005,13 +1075,14 @@
             <w:r>
               <w:rPr>
                 <w:rStyle w:val="Hyperlink"/>
-                <w:rFonts w:ascii="Times New Roman" w:hAnsi="Times New Roman"/>
+                <w:rFonts w:ascii="Times New Roman" w:hAnsi="Times New Roman" w:cs="Times New Roman"/>
                 <w:noProof/>
               </w:rPr>
               <w:t>6.0 Technical Description</w:t>
             </w:r>
             <w:r>
               <w:rPr>
+                <w:rFonts w:ascii="Times New Roman" w:hAnsi="Times New Roman" w:cs="Times New Roman"/>
                 <w:noProof/>
                 <w:webHidden/>
               </w:rPr>
@@ -1019,6 +1090,7 @@
             </w:r>
             <w:r>
               <w:rPr>
+                <w:rFonts w:ascii="Times New Roman" w:hAnsi="Times New Roman" w:cs="Times New Roman"/>
                 <w:noProof/>
                 <w:webHidden/>
               </w:rPr>
@@ -1026,6 +1098,7 @@
             </w:r>
             <w:r>
               <w:rPr>
+                <w:rFonts w:ascii="Times New Roman" w:hAnsi="Times New Roman" w:cs="Times New Roman"/>
                 <w:noProof/>
                 <w:webHidden/>
               </w:rPr>
@@ -1033,12 +1106,14 @@
             </w:r>
             <w:r>
               <w:rPr>
+                <w:rFonts w:ascii="Times New Roman" w:hAnsi="Times New Roman" w:cs="Times New Roman"/>
                 <w:noProof/>
                 <w:webHidden/>
               </w:rPr>
             </w:r>
             <w:r>
               <w:rPr>
+                <w:rFonts w:ascii="Times New Roman" w:hAnsi="Times New Roman" w:cs="Times New Roman"/>
                 <w:noProof/>
                 <w:webHidden/>
               </w:rPr>
@@ -1046,6 +1121,7 @@
             </w:r>
             <w:r>
               <w:rPr>
+                <w:rFonts w:ascii="Times New Roman" w:hAnsi="Times New Roman" w:cs="Times New Roman"/>
                 <w:noProof/>
                 <w:webHidden/>
               </w:rPr>
@@ -1053,6 +1129,7 @@
             </w:r>
             <w:r>
               <w:rPr>
+                <w:rFonts w:ascii="Times New Roman" w:hAnsi="Times New Roman" w:cs="Times New Roman"/>
                 <w:noProof/>
                 <w:webHidden/>
               </w:rPr>
@@ -1067,7 +1144,7 @@
               <w:tab w:val="right" w:leader="dot" w:pos="9016"/>
             </w:tabs>
             <w:rPr>
-              <w:rFonts w:eastAsiaTheme="minorEastAsia" w:cstheme="minorBidi"/>
+              <w:rFonts w:ascii="Times New Roman" w:eastAsiaTheme="minorEastAsia" w:hAnsi="Times New Roman" w:cs="Times New Roman"/>
               <w:noProof/>
               <w:sz w:val="24"/>
               <w:szCs w:val="30"/>
@@ -1077,13 +1154,14 @@
             <w:r>
               <w:rPr>
                 <w:rStyle w:val="Hyperlink"/>
-                <w:rFonts w:ascii="Times New Roman" w:hAnsi="Times New Roman"/>
+                <w:rFonts w:ascii="Times New Roman" w:hAnsi="Times New Roman" w:cs="Times New Roman"/>
                 <w:noProof/>
               </w:rPr>
               <w:t>6.1 Development Platform</w:t>
             </w:r>
             <w:r>
               <w:rPr>
+                <w:rFonts w:ascii="Times New Roman" w:hAnsi="Times New Roman" w:cs="Times New Roman"/>
                 <w:noProof/>
                 <w:webHidden/>
               </w:rPr>
@@ -1091,6 +1169,7 @@
             </w:r>
             <w:r>
               <w:rPr>
+                <w:rFonts w:ascii="Times New Roman" w:hAnsi="Times New Roman" w:cs="Times New Roman"/>
                 <w:noProof/>
                 <w:webHidden/>
               </w:rPr>
@@ -1098,6 +1177,7 @@
             </w:r>
             <w:r>
               <w:rPr>
+                <w:rFonts w:ascii="Times New Roman" w:hAnsi="Times New Roman" w:cs="Times New Roman"/>
                 <w:noProof/>
                 <w:webHidden/>
               </w:rPr>
@@ -1105,12 +1185,14 @@
             </w:r>
             <w:r>
               <w:rPr>
+                <w:rFonts w:ascii="Times New Roman" w:hAnsi="Times New Roman" w:cs="Times New Roman"/>
                 <w:noProof/>
                 <w:webHidden/>
               </w:rPr>
             </w:r>
             <w:r>
               <w:rPr>
+                <w:rFonts w:ascii="Times New Roman" w:hAnsi="Times New Roman" w:cs="Times New Roman"/>
                 <w:noProof/>
                 <w:webHidden/>
               </w:rPr>
@@ -1118,6 +1200,7 @@
             </w:r>
             <w:r>
               <w:rPr>
+                <w:rFonts w:ascii="Times New Roman" w:hAnsi="Times New Roman" w:cs="Times New Roman"/>
                 <w:noProof/>
                 <w:webHidden/>
               </w:rPr>
@@ -1125,6 +1208,7 @@
             </w:r>
             <w:r>
               <w:rPr>
+                <w:rFonts w:ascii="Times New Roman" w:hAnsi="Times New Roman" w:cs="Times New Roman"/>
                 <w:noProof/>
                 <w:webHidden/>
               </w:rPr>
@@ -1139,7 +1223,7 @@
               <w:tab w:val="right" w:leader="dot" w:pos="9016"/>
             </w:tabs>
             <w:rPr>
-              <w:rFonts w:eastAsiaTheme="minorEastAsia" w:cstheme="minorBidi"/>
+              <w:rFonts w:ascii="Times New Roman" w:eastAsiaTheme="minorEastAsia" w:hAnsi="Times New Roman" w:cs="Times New Roman"/>
               <w:noProof/>
               <w:sz w:val="24"/>
               <w:szCs w:val="30"/>
@@ -1149,13 +1233,14 @@
             <w:r>
               <w:rPr>
                 <w:rStyle w:val="Hyperlink"/>
-                <w:rFonts w:ascii="Times New Roman" w:hAnsi="Times New Roman"/>
+                <w:rFonts w:ascii="Times New Roman" w:hAnsi="Times New Roman" w:cs="Times New Roman"/>
                 <w:noProof/>
               </w:rPr>
               <w:t>6.2 Demonstration Platform</w:t>
             </w:r>
             <w:r>
               <w:rPr>
+                <w:rFonts w:ascii="Times New Roman" w:hAnsi="Times New Roman" w:cs="Times New Roman"/>
                 <w:noProof/>
                 <w:webHidden/>
               </w:rPr>
@@ -1163,6 +1248,7 @@
             </w:r>
             <w:r>
               <w:rPr>
+                <w:rFonts w:ascii="Times New Roman" w:hAnsi="Times New Roman" w:cs="Times New Roman"/>
                 <w:noProof/>
                 <w:webHidden/>
               </w:rPr>
@@ -1170,6 +1256,7 @@
             </w:r>
             <w:r>
               <w:rPr>
+                <w:rFonts w:ascii="Times New Roman" w:hAnsi="Times New Roman" w:cs="Times New Roman"/>
                 <w:noProof/>
                 <w:webHidden/>
               </w:rPr>
@@ -1177,12 +1264,14 @@
             </w:r>
             <w:r>
               <w:rPr>
+                <w:rFonts w:ascii="Times New Roman" w:hAnsi="Times New Roman" w:cs="Times New Roman"/>
                 <w:noProof/>
                 <w:webHidden/>
               </w:rPr>
             </w:r>
             <w:r>
               <w:rPr>
+                <w:rFonts w:ascii="Times New Roman" w:hAnsi="Times New Roman" w:cs="Times New Roman"/>
                 <w:noProof/>
                 <w:webHidden/>
               </w:rPr>
@@ -1190,6 +1279,7 @@
             </w:r>
             <w:r>
               <w:rPr>
+                <w:rFonts w:ascii="Times New Roman" w:hAnsi="Times New Roman" w:cs="Times New Roman"/>
                 <w:noProof/>
                 <w:webHidden/>
               </w:rPr>
@@ -1197,6 +1287,7 @@
             </w:r>
             <w:r>
               <w:rPr>
+                <w:rFonts w:ascii="Times New Roman" w:hAnsi="Times New Roman" w:cs="Times New Roman"/>
                 <w:noProof/>
                 <w:webHidden/>
               </w:rPr>
@@ -1211,7 +1302,7 @@
               <w:tab w:val="right" w:leader="dot" w:pos="9016"/>
             </w:tabs>
             <w:rPr>
-              <w:rFonts w:eastAsiaTheme="minorEastAsia" w:cstheme="minorBidi"/>
+              <w:rFonts w:ascii="Times New Roman" w:eastAsiaTheme="minorEastAsia" w:hAnsi="Times New Roman" w:cs="Times New Roman"/>
               <w:noProof/>
               <w:sz w:val="24"/>
               <w:szCs w:val="30"/>
@@ -1221,13 +1312,14 @@
             <w:r>
               <w:rPr>
                 <w:rStyle w:val="Hyperlink"/>
-                <w:rFonts w:ascii="Times New Roman" w:hAnsi="Times New Roman"/>
+                <w:rFonts w:ascii="Times New Roman" w:hAnsi="Times New Roman" w:cs="Times New Roman"/>
                 <w:noProof/>
               </w:rPr>
               <w:t>7.0 Risk Management Plan</w:t>
             </w:r>
             <w:r>
               <w:rPr>
+                <w:rFonts w:ascii="Times New Roman" w:hAnsi="Times New Roman" w:cs="Times New Roman"/>
                 <w:noProof/>
                 <w:webHidden/>
               </w:rPr>
@@ -1235,6 +1327,7 @@
             </w:r>
             <w:r>
               <w:rPr>
+                <w:rFonts w:ascii="Times New Roman" w:hAnsi="Times New Roman" w:cs="Times New Roman"/>
                 <w:noProof/>
                 <w:webHidden/>
               </w:rPr>
@@ -1242,6 +1335,7 @@
             </w:r>
             <w:r>
               <w:rPr>
+                <w:rFonts w:ascii="Times New Roman" w:hAnsi="Times New Roman" w:cs="Times New Roman"/>
                 <w:noProof/>
                 <w:webHidden/>
               </w:rPr>
@@ -1249,12 +1343,14 @@
             </w:r>
             <w:r>
               <w:rPr>
+                <w:rFonts w:ascii="Times New Roman" w:hAnsi="Times New Roman" w:cs="Times New Roman"/>
                 <w:noProof/>
                 <w:webHidden/>
               </w:rPr>
             </w:r>
             <w:r>
               <w:rPr>
+                <w:rFonts w:ascii="Times New Roman" w:hAnsi="Times New Roman" w:cs="Times New Roman"/>
                 <w:noProof/>
                 <w:webHidden/>
               </w:rPr>
@@ -1262,6 +1358,7 @@
             </w:r>
             <w:r>
               <w:rPr>
+                <w:rFonts w:ascii="Times New Roman" w:hAnsi="Times New Roman" w:cs="Times New Roman"/>
                 <w:noProof/>
                 <w:webHidden/>
               </w:rPr>
@@ -1269,6 +1366,7 @@
             </w:r>
             <w:r>
               <w:rPr>
+                <w:rFonts w:ascii="Times New Roman" w:hAnsi="Times New Roman" w:cs="Times New Roman"/>
                 <w:noProof/>
                 <w:webHidden/>
               </w:rPr>
@@ -1283,7 +1381,7 @@
               <w:tab w:val="right" w:leader="dot" w:pos="9016"/>
             </w:tabs>
             <w:rPr>
-              <w:rFonts w:eastAsiaTheme="minorEastAsia" w:cstheme="minorBidi"/>
+              <w:rFonts w:ascii="Times New Roman" w:eastAsiaTheme="minorEastAsia" w:hAnsi="Times New Roman" w:cs="Times New Roman"/>
               <w:noProof/>
               <w:sz w:val="24"/>
               <w:szCs w:val="30"/>
@@ -1293,13 +1391,14 @@
             <w:r>
               <w:rPr>
                 <w:rStyle w:val="Hyperlink"/>
-                <w:rFonts w:ascii="Times New Roman" w:hAnsi="Times New Roman"/>
+                <w:rFonts w:ascii="Times New Roman" w:hAnsi="Times New Roman" w:cs="Times New Roman"/>
                 <w:noProof/>
               </w:rPr>
               <w:t>8.0 GitHub Link</w:t>
             </w:r>
             <w:r>
               <w:rPr>
+                <w:rFonts w:ascii="Times New Roman" w:hAnsi="Times New Roman" w:cs="Times New Roman"/>
                 <w:noProof/>
                 <w:webHidden/>
               </w:rPr>
@@ -1307,6 +1406,7 @@
             </w:r>
             <w:r>
               <w:rPr>
+                <w:rFonts w:ascii="Times New Roman" w:hAnsi="Times New Roman" w:cs="Times New Roman"/>
                 <w:noProof/>
                 <w:webHidden/>
               </w:rPr>
@@ -1314,6 +1414,7 @@
             </w:r>
             <w:r>
               <w:rPr>
+                <w:rFonts w:ascii="Times New Roman" w:hAnsi="Times New Roman" w:cs="Times New Roman"/>
                 <w:noProof/>
                 <w:webHidden/>
               </w:rPr>
@@ -1321,12 +1422,14 @@
             </w:r>
             <w:r>
               <w:rPr>
+                <w:rFonts w:ascii="Times New Roman" w:hAnsi="Times New Roman" w:cs="Times New Roman"/>
                 <w:noProof/>
                 <w:webHidden/>
               </w:rPr>
             </w:r>
             <w:r>
               <w:rPr>
+                <w:rFonts w:ascii="Times New Roman" w:hAnsi="Times New Roman" w:cs="Times New Roman"/>
                 <w:noProof/>
                 <w:webHidden/>
               </w:rPr>
@@ -1334,6 +1437,7 @@
             </w:r>
             <w:r>
               <w:rPr>
+                <w:rFonts w:ascii="Times New Roman" w:hAnsi="Times New Roman" w:cs="Times New Roman"/>
                 <w:noProof/>
                 <w:webHidden/>
               </w:rPr>
@@ -1341,6 +1445,7 @@
             </w:r>
             <w:r>
               <w:rPr>
+                <w:rFonts w:ascii="Times New Roman" w:hAnsi="Times New Roman" w:cs="Times New Roman"/>
                 <w:noProof/>
                 <w:webHidden/>
               </w:rPr>
@@ -1355,7 +1460,7 @@
               <w:tab w:val="right" w:leader="dot" w:pos="9016"/>
             </w:tabs>
             <w:rPr>
-              <w:rFonts w:eastAsiaTheme="minorEastAsia" w:cstheme="minorBidi"/>
+              <w:rFonts w:ascii="Times New Roman" w:eastAsiaTheme="minorEastAsia" w:hAnsi="Times New Roman" w:cs="Times New Roman"/>
               <w:noProof/>
               <w:sz w:val="24"/>
               <w:szCs w:val="30"/>
@@ -1365,13 +1470,14 @@
             <w:r>
               <w:rPr>
                 <w:rStyle w:val="Hyperlink"/>
-                <w:rFonts w:ascii="Times New Roman" w:hAnsi="Times New Roman"/>
+                <w:rFonts w:ascii="Times New Roman" w:hAnsi="Times New Roman" w:cs="Times New Roman"/>
                 <w:noProof/>
               </w:rPr>
               <w:t>9.0 References</w:t>
             </w:r>
             <w:r>
               <w:rPr>
+                <w:rFonts w:ascii="Times New Roman" w:hAnsi="Times New Roman" w:cs="Times New Roman"/>
                 <w:noProof/>
                 <w:webHidden/>
               </w:rPr>
@@ -1379,6 +1485,7 @@
             </w:r>
             <w:r>
               <w:rPr>
+                <w:rFonts w:ascii="Times New Roman" w:hAnsi="Times New Roman" w:cs="Times New Roman"/>
                 <w:noProof/>
                 <w:webHidden/>
               </w:rPr>
@@ -1386,6 +1493,7 @@
             </w:r>
             <w:r>
               <w:rPr>
+                <w:rFonts w:ascii="Times New Roman" w:hAnsi="Times New Roman" w:cs="Times New Roman"/>
                 <w:noProof/>
                 <w:webHidden/>
               </w:rPr>
@@ -1393,12 +1501,14 @@
             </w:r>
             <w:r>
               <w:rPr>
+                <w:rFonts w:ascii="Times New Roman" w:hAnsi="Times New Roman" w:cs="Times New Roman"/>
                 <w:noProof/>
                 <w:webHidden/>
               </w:rPr>
             </w:r>
             <w:r>
               <w:rPr>
+                <w:rFonts w:ascii="Times New Roman" w:hAnsi="Times New Roman" w:cs="Times New Roman"/>
                 <w:noProof/>
                 <w:webHidden/>
               </w:rPr>
@@ -1406,6 +1516,7 @@
             </w:r>
             <w:r>
               <w:rPr>
+                <w:rFonts w:ascii="Times New Roman" w:hAnsi="Times New Roman" w:cs="Times New Roman"/>
                 <w:noProof/>
                 <w:webHidden/>
               </w:rPr>
@@ -1413,6 +1524,7 @@
             </w:r>
             <w:r>
               <w:rPr>
+                <w:rFonts w:ascii="Times New Roman" w:hAnsi="Times New Roman" w:cs="Times New Roman"/>
                 <w:noProof/>
                 <w:webHidden/>
               </w:rPr>
@@ -2560,6 +2672,53 @@
       </w:r>
       <w:bookmarkEnd w:id="7"/>
     </w:p>
+    <w:p>
+      <w:pPr>
+        <w:rPr>
+          <w:rFonts w:ascii="Times New Roman" w:hAnsi="Times New Roman"/>
+          <w:sz w:val="24"/>
+        </w:rPr>
+      </w:pPr>
+      <w:r>
+        <w:rPr>
+          <w:rFonts w:ascii="Times New Roman" w:hAnsi="Times New Roman"/>
+          <w:sz w:val="24"/>
+        </w:rPr>
+        <w:t xml:space="preserve">This is the WBS which was made separately  in the excel is pasted here . But the actual WBS file is uploaded in the </w:t>
+      </w:r>
+      <w:proofErr w:type="spellStart"/>
+      <w:r>
+        <w:rPr>
+          <w:rFonts w:ascii="Times New Roman" w:hAnsi="Times New Roman"/>
+          <w:sz w:val="24"/>
+        </w:rPr>
+        <w:t>github</w:t>
+      </w:r>
+      <w:proofErr w:type="spellEnd"/>
+      <w:r>
+        <w:rPr>
+          <w:rFonts w:ascii="Times New Roman" w:hAnsi="Times New Roman"/>
+          <w:sz w:val="24"/>
+        </w:rPr>
+        <w:t xml:space="preserve"> folder. The link of the </w:t>
+      </w:r>
+      <w:proofErr w:type="spellStart"/>
+      <w:r>
+        <w:rPr>
+          <w:rFonts w:ascii="Times New Roman" w:hAnsi="Times New Roman"/>
+          <w:sz w:val="24"/>
+        </w:rPr>
+        <w:t>github</w:t>
+      </w:r>
+      <w:proofErr w:type="spellEnd"/>
+      <w:r>
+        <w:rPr>
+          <w:rFonts w:ascii="Times New Roman" w:hAnsi="Times New Roman"/>
+          <w:sz w:val="24"/>
+        </w:rPr>
+        <w:t xml:space="preserve"> is given at the end of the report.</w:t>
+      </w:r>
+    </w:p>
     <w:tbl>
       <w:tblPr>
         <w:tblStyle w:val="TableGrid"/>
@@ -6885,6 +7044,7 @@
                 <w:sz w:val="20"/>
                 <w:szCs w:val="20"/>
               </w:rPr>
+              <w:lastRenderedPageBreak/>
               <w:t>3.1</w:t>
             </w:r>
           </w:p>
@@ -7257,7 +7417,6 @@
                 <w:sz w:val="20"/>
                 <w:szCs w:val="20"/>
               </w:rPr>
-              <w:lastRenderedPageBreak/>
               <w:t>3.1.2</w:t>
             </w:r>
           </w:p>
@@ -11192,6 +11351,7 @@
                 <w:sz w:val="20"/>
                 <w:szCs w:val="20"/>
               </w:rPr>
+              <w:lastRenderedPageBreak/>
               <w:t>5.1.1</w:t>
             </w:r>
           </w:p>
@@ -11596,7 +11756,6 @@
                 <w:sz w:val="20"/>
                 <w:szCs w:val="20"/>
               </w:rPr>
-              <w:lastRenderedPageBreak/>
               <w:t>5.2.1</w:t>
             </w:r>
           </w:p>
@@ -13580,7 +13739,7 @@
                 <w:rFonts w:ascii="Times New Roman" w:hAnsi="Times New Roman"/>
                 <w:sz w:val="24"/>
               </w:rPr>
-              <w:t>Iteration 1 Complete Prototype</w:t>
+              <w:t>Working UC1 Feature</w:t>
             </w:r>
           </w:p>
         </w:tc>
@@ -13601,7 +13760,7 @@
                 <w:rFonts w:ascii="Times New Roman" w:hAnsi="Times New Roman"/>
                 <w:sz w:val="24"/>
               </w:rPr>
-              <w:t>14</w:t>
+              <w:t>30</w:t>
             </w:r>
             <w:r>
               <w:rPr>
@@ -13616,7 +13775,7 @@
                 <w:rFonts w:ascii="Times New Roman" w:hAnsi="Times New Roman"/>
                 <w:sz w:val="24"/>
               </w:rPr>
-              <w:t xml:space="preserve"> July 2026</w:t>
+              <w:t xml:space="preserve"> June 2026</w:t>
             </w:r>
           </w:p>
         </w:tc>
@@ -13660,6 +13819,549 @@
                 <w:rFonts w:ascii="Times New Roman" w:hAnsi="Times New Roman"/>
                 <w:sz w:val="24"/>
               </w:rPr>
+              <w:t>Working UC2 Feature</w:t>
+            </w:r>
+          </w:p>
+        </w:tc>
+        <w:tc>
+          <w:tcPr>
+            <w:tcW w:w="3006" w:type="dxa"/>
+          </w:tcPr>
+          <w:p>
+            <w:pPr>
+              <w:spacing w:after="0" w:line="360" w:lineRule="auto"/>
+              <w:rPr>
+                <w:rFonts w:ascii="Times New Roman" w:hAnsi="Times New Roman"/>
+                <w:sz w:val="24"/>
+              </w:rPr>
+            </w:pPr>
+            <w:r>
+              <w:rPr>
+                <w:rFonts w:ascii="Times New Roman" w:hAnsi="Times New Roman"/>
+                <w:sz w:val="24"/>
+              </w:rPr>
+              <w:t>7</w:t>
+            </w:r>
+            <w:r>
+              <w:rPr>
+                <w:rFonts w:ascii="Times New Roman" w:hAnsi="Times New Roman"/>
+                <w:sz w:val="24"/>
+                <w:vertAlign w:val="superscript"/>
+              </w:rPr>
+              <w:t>th</w:t>
+            </w:r>
+            <w:r>
+              <w:rPr>
+                <w:rFonts w:ascii="Times New Roman" w:hAnsi="Times New Roman"/>
+                <w:sz w:val="24"/>
+              </w:rPr>
+              <w:t xml:space="preserve"> July 2026</w:t>
+            </w:r>
+          </w:p>
+        </w:tc>
+      </w:tr>
+      <w:tr>
+        <w:tc>
+          <w:tcPr>
+            <w:tcW w:w="1255" w:type="dxa"/>
+          </w:tcPr>
+          <w:p>
+            <w:pPr>
+              <w:spacing w:after="0" w:line="360" w:lineRule="auto"/>
+              <w:rPr>
+                <w:rFonts w:ascii="Times New Roman" w:hAnsi="Times New Roman"/>
+                <w:sz w:val="24"/>
+              </w:rPr>
+            </w:pPr>
+            <w:r>
+              <w:rPr>
+                <w:rFonts w:ascii="Times New Roman" w:hAnsi="Times New Roman"/>
+                <w:sz w:val="24"/>
+              </w:rPr>
+              <w:t>M6</w:t>
+            </w:r>
+          </w:p>
+        </w:tc>
+        <w:tc>
+          <w:tcPr>
+            <w:tcW w:w="4755" w:type="dxa"/>
+          </w:tcPr>
+          <w:p>
+            <w:pPr>
+              <w:spacing w:after="0" w:line="360" w:lineRule="auto"/>
+              <w:rPr>
+                <w:rFonts w:ascii="Times New Roman" w:hAnsi="Times New Roman"/>
+                <w:sz w:val="24"/>
+              </w:rPr>
+            </w:pPr>
+            <w:r>
+              <w:rPr>
+                <w:rFonts w:ascii="Times New Roman" w:hAnsi="Times New Roman"/>
+                <w:sz w:val="24"/>
+              </w:rPr>
+              <w:t>Working UC</w:t>
+            </w:r>
+            <w:r>
+              <w:rPr>
+                <w:rFonts w:ascii="Times New Roman" w:hAnsi="Times New Roman"/>
+                <w:sz w:val="24"/>
+              </w:rPr>
+              <w:t>3</w:t>
+            </w:r>
+            <w:r>
+              <w:rPr>
+                <w:rFonts w:ascii="Times New Roman" w:hAnsi="Times New Roman"/>
+                <w:sz w:val="24"/>
+              </w:rPr>
+              <w:t xml:space="preserve"> Feature</w:t>
+            </w:r>
+          </w:p>
+        </w:tc>
+        <w:tc>
+          <w:tcPr>
+            <w:tcW w:w="3006" w:type="dxa"/>
+          </w:tcPr>
+          <w:p>
+            <w:pPr>
+              <w:spacing w:after="0" w:line="360" w:lineRule="auto"/>
+              <w:rPr>
+                <w:rFonts w:ascii="Times New Roman" w:hAnsi="Times New Roman"/>
+                <w:sz w:val="24"/>
+              </w:rPr>
+            </w:pPr>
+            <w:r>
+              <w:rPr>
+                <w:rFonts w:ascii="Times New Roman" w:hAnsi="Times New Roman"/>
+                <w:sz w:val="24"/>
+              </w:rPr>
+              <w:t>12</w:t>
+            </w:r>
+            <w:r>
+              <w:rPr>
+                <w:rFonts w:ascii="Times New Roman" w:hAnsi="Times New Roman"/>
+                <w:sz w:val="24"/>
+                <w:vertAlign w:val="superscript"/>
+              </w:rPr>
+              <w:t>th</w:t>
+            </w:r>
+            <w:r>
+              <w:rPr>
+                <w:rFonts w:ascii="Times New Roman" w:hAnsi="Times New Roman"/>
+                <w:sz w:val="24"/>
+              </w:rPr>
+              <w:t xml:space="preserve"> July 2026</w:t>
+            </w:r>
+          </w:p>
+        </w:tc>
+      </w:tr>
+      <w:tr>
+        <w:tc>
+          <w:tcPr>
+            <w:tcW w:w="1255" w:type="dxa"/>
+          </w:tcPr>
+          <w:p>
+            <w:pPr>
+              <w:spacing w:after="0" w:line="360" w:lineRule="auto"/>
+              <w:rPr>
+                <w:rFonts w:ascii="Times New Roman" w:hAnsi="Times New Roman"/>
+                <w:sz w:val="24"/>
+              </w:rPr>
+            </w:pPr>
+            <w:r>
+              <w:rPr>
+                <w:rFonts w:ascii="Times New Roman" w:hAnsi="Times New Roman"/>
+                <w:sz w:val="24"/>
+              </w:rPr>
+              <w:t>M7</w:t>
+            </w:r>
+          </w:p>
+        </w:tc>
+        <w:tc>
+          <w:tcPr>
+            <w:tcW w:w="4755" w:type="dxa"/>
+          </w:tcPr>
+          <w:p>
+            <w:pPr>
+              <w:spacing w:after="0" w:line="360" w:lineRule="auto"/>
+              <w:rPr>
+                <w:rFonts w:ascii="Times New Roman" w:hAnsi="Times New Roman"/>
+                <w:sz w:val="24"/>
+              </w:rPr>
+            </w:pPr>
+            <w:r>
+              <w:rPr>
+                <w:rFonts w:ascii="Times New Roman" w:hAnsi="Times New Roman"/>
+                <w:sz w:val="24"/>
+              </w:rPr>
+              <w:t>Iteration 1 Complete Prototype</w:t>
+            </w:r>
+          </w:p>
+        </w:tc>
+        <w:tc>
+          <w:tcPr>
+            <w:tcW w:w="3006" w:type="dxa"/>
+          </w:tcPr>
+          <w:p>
+            <w:pPr>
+              <w:spacing w:after="0" w:line="360" w:lineRule="auto"/>
+              <w:rPr>
+                <w:rFonts w:ascii="Times New Roman" w:hAnsi="Times New Roman"/>
+                <w:sz w:val="24"/>
+              </w:rPr>
+            </w:pPr>
+            <w:r>
+              <w:rPr>
+                <w:rFonts w:ascii="Times New Roman" w:hAnsi="Times New Roman"/>
+                <w:sz w:val="24"/>
+              </w:rPr>
+              <w:t>14</w:t>
+            </w:r>
+            <w:r>
+              <w:rPr>
+                <w:rFonts w:ascii="Times New Roman" w:hAnsi="Times New Roman"/>
+                <w:sz w:val="24"/>
+                <w:vertAlign w:val="superscript"/>
+              </w:rPr>
+              <w:t>th</w:t>
+            </w:r>
+            <w:r>
+              <w:rPr>
+                <w:rFonts w:ascii="Times New Roman" w:hAnsi="Times New Roman"/>
+                <w:sz w:val="24"/>
+              </w:rPr>
+              <w:t xml:space="preserve"> July 2026</w:t>
+            </w:r>
+          </w:p>
+        </w:tc>
+      </w:tr>
+      <w:tr>
+        <w:tc>
+          <w:tcPr>
+            <w:tcW w:w="1255" w:type="dxa"/>
+          </w:tcPr>
+          <w:p>
+            <w:pPr>
+              <w:spacing w:after="0" w:line="360" w:lineRule="auto"/>
+              <w:rPr>
+                <w:rFonts w:ascii="Times New Roman" w:hAnsi="Times New Roman"/>
+                <w:sz w:val="24"/>
+              </w:rPr>
+            </w:pPr>
+            <w:r>
+              <w:rPr>
+                <w:rFonts w:ascii="Times New Roman" w:hAnsi="Times New Roman"/>
+                <w:sz w:val="24"/>
+              </w:rPr>
+              <w:t>M8</w:t>
+            </w:r>
+          </w:p>
+        </w:tc>
+        <w:tc>
+          <w:tcPr>
+            <w:tcW w:w="4755" w:type="dxa"/>
+          </w:tcPr>
+          <w:p>
+            <w:pPr>
+              <w:spacing w:after="0" w:line="360" w:lineRule="auto"/>
+              <w:rPr>
+                <w:rFonts w:ascii="Times New Roman" w:hAnsi="Times New Roman"/>
+                <w:sz w:val="24"/>
+              </w:rPr>
+            </w:pPr>
+            <w:r>
+              <w:rPr>
+                <w:rFonts w:ascii="Times New Roman" w:hAnsi="Times New Roman"/>
+                <w:sz w:val="24"/>
+              </w:rPr>
+              <w:t>Working UC</w:t>
+            </w:r>
+            <w:r>
+              <w:rPr>
+                <w:rFonts w:ascii="Times New Roman" w:hAnsi="Times New Roman"/>
+                <w:sz w:val="24"/>
+              </w:rPr>
+              <w:t>4</w:t>
+            </w:r>
+            <w:r>
+              <w:rPr>
+                <w:rFonts w:ascii="Times New Roman" w:hAnsi="Times New Roman"/>
+                <w:sz w:val="24"/>
+              </w:rPr>
+              <w:t xml:space="preserve"> Feature</w:t>
+            </w:r>
+          </w:p>
+        </w:tc>
+        <w:tc>
+          <w:tcPr>
+            <w:tcW w:w="3006" w:type="dxa"/>
+          </w:tcPr>
+          <w:p>
+            <w:pPr>
+              <w:spacing w:after="0" w:line="360" w:lineRule="auto"/>
+              <w:rPr>
+                <w:rFonts w:ascii="Times New Roman" w:hAnsi="Times New Roman"/>
+                <w:sz w:val="24"/>
+              </w:rPr>
+            </w:pPr>
+            <w:r>
+              <w:rPr>
+                <w:rFonts w:ascii="Times New Roman" w:hAnsi="Times New Roman"/>
+                <w:sz w:val="24"/>
+              </w:rPr>
+              <w:t>18</w:t>
+            </w:r>
+            <w:r>
+              <w:rPr>
+                <w:rFonts w:ascii="Times New Roman" w:hAnsi="Times New Roman"/>
+                <w:sz w:val="24"/>
+                <w:vertAlign w:val="superscript"/>
+              </w:rPr>
+              <w:t>th</w:t>
+            </w:r>
+            <w:r>
+              <w:rPr>
+                <w:rFonts w:ascii="Times New Roman" w:hAnsi="Times New Roman"/>
+                <w:sz w:val="24"/>
+              </w:rPr>
+              <w:t xml:space="preserve"> July 2026</w:t>
+            </w:r>
+          </w:p>
+        </w:tc>
+      </w:tr>
+      <w:tr>
+        <w:tc>
+          <w:tcPr>
+            <w:tcW w:w="1255" w:type="dxa"/>
+          </w:tcPr>
+          <w:p>
+            <w:pPr>
+              <w:spacing w:after="0" w:line="360" w:lineRule="auto"/>
+              <w:rPr>
+                <w:rFonts w:ascii="Times New Roman" w:hAnsi="Times New Roman"/>
+                <w:sz w:val="24"/>
+              </w:rPr>
+            </w:pPr>
+            <w:r>
+              <w:rPr>
+                <w:rFonts w:ascii="Times New Roman" w:hAnsi="Times New Roman"/>
+                <w:sz w:val="24"/>
+              </w:rPr>
+              <w:t>M9</w:t>
+            </w:r>
+          </w:p>
+        </w:tc>
+        <w:tc>
+          <w:tcPr>
+            <w:tcW w:w="4755" w:type="dxa"/>
+          </w:tcPr>
+          <w:p>
+            <w:pPr>
+              <w:spacing w:after="0" w:line="360" w:lineRule="auto"/>
+              <w:rPr>
+                <w:rFonts w:ascii="Times New Roman" w:hAnsi="Times New Roman"/>
+                <w:sz w:val="24"/>
+              </w:rPr>
+            </w:pPr>
+            <w:r>
+              <w:rPr>
+                <w:rFonts w:ascii="Times New Roman" w:hAnsi="Times New Roman"/>
+                <w:sz w:val="24"/>
+              </w:rPr>
+              <w:t>Working UC</w:t>
+            </w:r>
+            <w:r>
+              <w:rPr>
+                <w:rFonts w:ascii="Times New Roman" w:hAnsi="Times New Roman"/>
+                <w:sz w:val="24"/>
+              </w:rPr>
+              <w:t>5</w:t>
+            </w:r>
+            <w:r>
+              <w:rPr>
+                <w:rFonts w:ascii="Times New Roman" w:hAnsi="Times New Roman"/>
+                <w:sz w:val="24"/>
+              </w:rPr>
+              <w:t xml:space="preserve"> Feature</w:t>
+            </w:r>
+          </w:p>
+        </w:tc>
+        <w:tc>
+          <w:tcPr>
+            <w:tcW w:w="3006" w:type="dxa"/>
+          </w:tcPr>
+          <w:p>
+            <w:pPr>
+              <w:spacing w:after="0" w:line="360" w:lineRule="auto"/>
+              <w:rPr>
+                <w:rFonts w:ascii="Times New Roman" w:hAnsi="Times New Roman"/>
+                <w:sz w:val="24"/>
+              </w:rPr>
+            </w:pPr>
+            <w:r>
+              <w:rPr>
+                <w:rFonts w:ascii="Times New Roman" w:hAnsi="Times New Roman"/>
+                <w:sz w:val="24"/>
+              </w:rPr>
+              <w:t>22</w:t>
+            </w:r>
+            <w:r>
+              <w:rPr>
+                <w:rFonts w:ascii="Times New Roman" w:hAnsi="Times New Roman"/>
+                <w:sz w:val="24"/>
+                <w:vertAlign w:val="superscript"/>
+              </w:rPr>
+              <w:t>nd</w:t>
+            </w:r>
+            <w:r>
+              <w:rPr>
+                <w:rFonts w:ascii="Times New Roman" w:hAnsi="Times New Roman"/>
+                <w:sz w:val="24"/>
+              </w:rPr>
+              <w:t xml:space="preserve"> July 2026</w:t>
+            </w:r>
+          </w:p>
+        </w:tc>
+      </w:tr>
+      <w:tr>
+        <w:tc>
+          <w:tcPr>
+            <w:tcW w:w="1255" w:type="dxa"/>
+          </w:tcPr>
+          <w:p>
+            <w:pPr>
+              <w:spacing w:after="0" w:line="360" w:lineRule="auto"/>
+              <w:rPr>
+                <w:rFonts w:ascii="Times New Roman" w:hAnsi="Times New Roman"/>
+                <w:sz w:val="24"/>
+              </w:rPr>
+            </w:pPr>
+            <w:r>
+              <w:rPr>
+                <w:rFonts w:ascii="Times New Roman" w:hAnsi="Times New Roman"/>
+                <w:sz w:val="24"/>
+              </w:rPr>
+              <w:t>M10</w:t>
+            </w:r>
+          </w:p>
+        </w:tc>
+        <w:tc>
+          <w:tcPr>
+            <w:tcW w:w="4755" w:type="dxa"/>
+          </w:tcPr>
+          <w:p>
+            <w:pPr>
+              <w:spacing w:after="0" w:line="360" w:lineRule="auto"/>
+              <w:rPr>
+                <w:rFonts w:ascii="Times New Roman" w:hAnsi="Times New Roman"/>
+                <w:sz w:val="24"/>
+              </w:rPr>
+            </w:pPr>
+            <w:r>
+              <w:rPr>
+                <w:rFonts w:ascii="Times New Roman" w:hAnsi="Times New Roman"/>
+                <w:sz w:val="24"/>
+              </w:rPr>
+              <w:t>Working UC</w:t>
+            </w:r>
+            <w:r>
+              <w:rPr>
+                <w:rFonts w:ascii="Times New Roman" w:hAnsi="Times New Roman"/>
+                <w:sz w:val="24"/>
+              </w:rPr>
+              <w:t>6</w:t>
+            </w:r>
+            <w:r>
+              <w:rPr>
+                <w:rFonts w:ascii="Times New Roman" w:hAnsi="Times New Roman"/>
+                <w:sz w:val="24"/>
+              </w:rPr>
+              <w:t xml:space="preserve"> Feature</w:t>
+            </w:r>
+          </w:p>
+        </w:tc>
+        <w:tc>
+          <w:tcPr>
+            <w:tcW w:w="3006" w:type="dxa"/>
+          </w:tcPr>
+          <w:p>
+            <w:pPr>
+              <w:spacing w:after="0" w:line="360" w:lineRule="auto"/>
+              <w:rPr>
+                <w:rFonts w:ascii="Times New Roman" w:hAnsi="Times New Roman"/>
+                <w:sz w:val="24"/>
+              </w:rPr>
+            </w:pPr>
+            <w:r>
+              <w:rPr>
+                <w:rFonts w:ascii="Times New Roman" w:hAnsi="Times New Roman"/>
+                <w:sz w:val="24"/>
+              </w:rPr>
+              <w:t>26</w:t>
+            </w:r>
+            <w:r>
+              <w:rPr>
+                <w:rFonts w:ascii="Times New Roman" w:hAnsi="Times New Roman"/>
+                <w:sz w:val="24"/>
+                <w:vertAlign w:val="superscript"/>
+              </w:rPr>
+              <w:t>th</w:t>
+            </w:r>
+            <w:r>
+              <w:rPr>
+                <w:rFonts w:ascii="Times New Roman" w:hAnsi="Times New Roman"/>
+                <w:sz w:val="24"/>
+              </w:rPr>
+              <w:t xml:space="preserve"> July 2026</w:t>
+            </w:r>
+          </w:p>
+        </w:tc>
+      </w:tr>
+      <w:tr>
+        <w:tc>
+          <w:tcPr>
+            <w:tcW w:w="1255" w:type="dxa"/>
+          </w:tcPr>
+          <w:p>
+            <w:pPr>
+              <w:spacing w:after="0" w:line="360" w:lineRule="auto"/>
+              <w:rPr>
+                <w:rFonts w:ascii="Times New Roman" w:hAnsi="Times New Roman"/>
+                <w:sz w:val="24"/>
+              </w:rPr>
+            </w:pPr>
+            <w:r>
+              <w:rPr>
+                <w:rFonts w:ascii="Times New Roman" w:hAnsi="Times New Roman"/>
+                <w:sz w:val="24"/>
+              </w:rPr>
+              <w:t>M</w:t>
+            </w:r>
+            <w:r>
+              <w:rPr>
+                <w:rFonts w:ascii="Times New Roman" w:hAnsi="Times New Roman"/>
+                <w:sz w:val="24"/>
+              </w:rPr>
+              <w:t>11</w:t>
+            </w:r>
+          </w:p>
+        </w:tc>
+        <w:tc>
+          <w:tcPr>
+            <w:tcW w:w="4755" w:type="dxa"/>
+          </w:tcPr>
+          <w:p>
+            <w:pPr>
+              <w:spacing w:after="0" w:line="360" w:lineRule="auto"/>
+              <w:rPr>
+                <w:rFonts w:ascii="Times New Roman" w:hAnsi="Times New Roman"/>
+                <w:sz w:val="24"/>
+              </w:rPr>
+            </w:pPr>
+            <w:r>
+              <w:rPr>
+                <w:rFonts w:ascii="Times New Roman" w:hAnsi="Times New Roman"/>
+                <w:sz w:val="24"/>
+              </w:rPr>
               <w:t>Iteration 2/ Assignment Submitted</w:t>
             </w:r>
           </w:p>
@@ -13702,42 +14404,6 @@
         </w:tc>
       </w:tr>
     </w:tbl>
-    <w:p>
-      <w:pPr>
-        <w:spacing w:line="360" w:lineRule="auto"/>
-        <w:rPr>
-          <w:rFonts w:ascii="Times New Roman" w:hAnsi="Times New Roman"/>
-          <w:sz w:val="24"/>
-        </w:rPr>
-      </w:pPr>
-    </w:p>
-    <w:p>
-      <w:pPr>
-        <w:spacing w:line="360" w:lineRule="auto"/>
-        <w:rPr>
-          <w:rFonts w:ascii="Times New Roman" w:hAnsi="Times New Roman"/>
-          <w:sz w:val="24"/>
-        </w:rPr>
-      </w:pPr>
-    </w:p>
-    <w:p>
-      <w:pPr>
-        <w:spacing w:line="360" w:lineRule="auto"/>
-        <w:rPr>
-          <w:rFonts w:ascii="Times New Roman" w:hAnsi="Times New Roman"/>
-          <w:sz w:val="24"/>
-        </w:rPr>
-      </w:pPr>
-    </w:p>
-    <w:p>
-      <w:pPr>
-        <w:spacing w:line="360" w:lineRule="auto"/>
-        <w:rPr>
-          <w:rFonts w:ascii="Times New Roman" w:hAnsi="Times New Roman"/>
-          <w:sz w:val="24"/>
-        </w:rPr>
-      </w:pPr>
-    </w:p>
     <w:p>
       <w:pPr>
         <w:spacing w:line="360" w:lineRule="auto"/>
@@ -13789,7 +14455,6 @@
           <w:rFonts w:ascii="Times New Roman" w:hAnsi="Times New Roman"/>
           <w:sz w:val="24"/>
         </w:rPr>
-        <w:lastRenderedPageBreak/>
         <w:t>5.3 Gantt Chart</w:t>
       </w:r>
       <w:bookmarkEnd w:id="9"/>
@@ -13818,11 +14483,21 @@
         </w:rPr>
         <w:t xml:space="preserve"> was used to construct the following Gantt chart which displays the baseline project timeline along with task dependencies, resource allocation and milestones</w:t>
       </w:r>
+      <w:r>
+        <w:rPr>
+          <w:rFonts w:ascii="Times New Roman" w:hAnsi="Times New Roman"/>
+          <w:sz w:val="24"/>
+        </w:rPr>
+        <w:t>.</w:t>
+      </w:r>
     </w:p>
     <w:p>
       <w:pPr>
         <w:keepNext/>
         <w:spacing w:line="360" w:lineRule="auto"/>
+        <w:rPr>
+          <w:rFonts w:ascii="Times New Roman" w:hAnsi="Times New Roman"/>
+        </w:rPr>
       </w:pPr>
       <w:r>
         <w:rPr>
@@ -13832,7 +14507,7 @@
           <w14:ligatures w14:val="none"/>
         </w:rPr>
         <w:drawing>
-          <wp:inline distT="0" distB="0" distL="0" distR="0" wp14:anchorId="39FE564E" wp14:editId="25F99CC1">
+          <wp:inline distT="0" distB="0" distL="0" distR="0" wp14:anchorId="39FE564E" wp14:editId="0C35F473">
             <wp:extent cx="4625340" cy="5237714"/>
             <wp:effectExtent l="0" t="0" r="3810" b="1270"/>
             <wp:docPr id="544552236" name="Picture 1"/>
@@ -13885,39 +14560,240 @@
         </w:rPr>
       </w:pPr>
       <w:r>
+        <w:rPr>
+          <w:rFonts w:ascii="Times New Roman" w:hAnsi="Times New Roman" w:cs="Times New Roman"/>
+        </w:rPr>
         <w:t xml:space="preserve">Figure </w:t>
       </w:r>
       <w:r>
+        <w:rPr>
+          <w:rFonts w:ascii="Times New Roman" w:hAnsi="Times New Roman" w:cs="Times New Roman"/>
+        </w:rPr>
         <w:fldChar w:fldCharType="begin"/>
       </w:r>
       <w:r>
+        <w:rPr>
+          <w:rFonts w:ascii="Times New Roman" w:hAnsi="Times New Roman" w:cs="Times New Roman"/>
+        </w:rPr>
         <w:instrText xml:space="preserve"> SEQ Figure \* ARABIC </w:instrText>
       </w:r>
       <w:r>
+        <w:rPr>
+          <w:rFonts w:ascii="Times New Roman" w:hAnsi="Times New Roman" w:cs="Times New Roman"/>
+        </w:rPr>
         <w:fldChar w:fldCharType="separate"/>
       </w:r>
       <w:r>
         <w:rPr>
+          <w:rFonts w:ascii="Times New Roman" w:hAnsi="Times New Roman" w:cs="Times New Roman"/>
           <w:noProof/>
         </w:rPr>
         <w:t>1</w:t>
       </w:r>
       <w:r>
+        <w:rPr>
+          <w:rFonts w:ascii="Times New Roman" w:hAnsi="Times New Roman" w:cs="Times New Roman"/>
+        </w:rPr>
         <w:fldChar w:fldCharType="end"/>
       </w:r>
       <w:r>
         <w:rPr>
+          <w:rFonts w:ascii="Times New Roman" w:hAnsi="Times New Roman" w:cs="Times New Roman"/>
           <w:noProof/>
         </w:rPr>
         <w:t xml:space="preserve"> Gantt Chart</w:t>
       </w:r>
     </w:p>
-    <w:p/>
-    <w:p/>
-    <w:p/>
-    <w:p/>
-    <w:p/>
-    <w:p/>
+    <w:p>
+      <w:pPr>
+        <w:rPr>
+          <w:rFonts w:ascii="Times New Roman" w:hAnsi="Times New Roman"/>
+          <w:sz w:val="24"/>
+        </w:rPr>
+      </w:pPr>
+      <w:r>
+        <w:rPr>
+          <w:rFonts w:ascii="Times New Roman" w:hAnsi="Times New Roman"/>
+          <w:sz w:val="24"/>
+        </w:rPr>
+        <w:t xml:space="preserve">Since the image of the </w:t>
+      </w:r>
+      <w:proofErr w:type="spellStart"/>
+      <w:r>
+        <w:rPr>
+          <w:rFonts w:ascii="Times New Roman" w:hAnsi="Times New Roman"/>
+          <w:sz w:val="24"/>
+        </w:rPr>
+        <w:t>gantt</w:t>
+      </w:r>
+      <w:proofErr w:type="spellEnd"/>
+      <w:r>
+        <w:rPr>
+          <w:rFonts w:ascii="Times New Roman" w:hAnsi="Times New Roman"/>
+          <w:sz w:val="24"/>
+        </w:rPr>
+        <w:t xml:space="preserve"> chart was exported as a</w:t>
+      </w:r>
+      <w:r>
+        <w:rPr>
+          <w:rFonts w:ascii="Times New Roman" w:hAnsi="Times New Roman"/>
+          <w:sz w:val="24"/>
+        </w:rPr>
+        <w:t xml:space="preserve"> </w:t>
+      </w:r>
+      <w:proofErr w:type="spellStart"/>
+      <w:r>
+        <w:rPr>
+          <w:rFonts w:ascii="Times New Roman" w:hAnsi="Times New Roman"/>
+          <w:sz w:val="24"/>
+        </w:rPr>
+        <w:t>png</w:t>
+      </w:r>
+      <w:proofErr w:type="spellEnd"/>
+      <w:r>
+        <w:rPr>
+          <w:rFonts w:ascii="Times New Roman" w:hAnsi="Times New Roman"/>
+          <w:sz w:val="24"/>
+        </w:rPr>
+        <w:t xml:space="preserve"> </w:t>
+      </w:r>
+      <w:r>
+        <w:rPr>
+          <w:rFonts w:ascii="Times New Roman" w:hAnsi="Times New Roman"/>
+          <w:sz w:val="24"/>
+        </w:rPr>
+        <w:t xml:space="preserve"> image from the app </w:t>
+      </w:r>
+      <w:proofErr w:type="spellStart"/>
+      <w:r>
+        <w:rPr>
+          <w:rFonts w:ascii="Times New Roman" w:hAnsi="Times New Roman"/>
+          <w:sz w:val="24"/>
+        </w:rPr>
+        <w:t>GanttProject</w:t>
+      </w:r>
+      <w:proofErr w:type="spellEnd"/>
+      <w:r>
+        <w:rPr>
+          <w:rFonts w:ascii="Times New Roman" w:hAnsi="Times New Roman"/>
+          <w:sz w:val="24"/>
+        </w:rPr>
+        <w:t xml:space="preserve">, the image is looking a bit </w:t>
+      </w:r>
+      <w:proofErr w:type="spellStart"/>
+      <w:r>
+        <w:rPr>
+          <w:rFonts w:ascii="Times New Roman" w:hAnsi="Times New Roman"/>
+          <w:sz w:val="24"/>
+        </w:rPr>
+        <w:t>con</w:t>
+      </w:r>
+      <w:r>
+        <w:rPr>
+          <w:rFonts w:ascii="Times New Roman" w:hAnsi="Times New Roman"/>
+          <w:sz w:val="24"/>
+        </w:rPr>
+        <w:t>g</w:t>
+      </w:r>
+      <w:r>
+        <w:rPr>
+          <w:rFonts w:ascii="Times New Roman" w:hAnsi="Times New Roman"/>
+          <w:sz w:val="24"/>
+        </w:rPr>
+        <w:t>usted</w:t>
+      </w:r>
+      <w:proofErr w:type="spellEnd"/>
+      <w:r>
+        <w:rPr>
+          <w:rFonts w:ascii="Times New Roman" w:hAnsi="Times New Roman"/>
+          <w:sz w:val="24"/>
+        </w:rPr>
+        <w:t xml:space="preserve"> but the actual </w:t>
+      </w:r>
+      <w:proofErr w:type="spellStart"/>
+      <w:r>
+        <w:rPr>
+          <w:rFonts w:ascii="Times New Roman" w:hAnsi="Times New Roman"/>
+          <w:sz w:val="24"/>
+        </w:rPr>
+        <w:t>ganttproject</w:t>
+      </w:r>
+      <w:proofErr w:type="spellEnd"/>
+      <w:r>
+        <w:rPr>
+          <w:rFonts w:ascii="Times New Roman" w:hAnsi="Times New Roman"/>
+          <w:sz w:val="24"/>
+        </w:rPr>
+        <w:t xml:space="preserve"> file is uploaded in the </w:t>
+      </w:r>
+      <w:proofErr w:type="spellStart"/>
+      <w:r>
+        <w:rPr>
+          <w:rFonts w:ascii="Times New Roman" w:hAnsi="Times New Roman"/>
+          <w:sz w:val="24"/>
+        </w:rPr>
+        <w:t>github</w:t>
+      </w:r>
+      <w:proofErr w:type="spellEnd"/>
+      <w:r>
+        <w:rPr>
+          <w:rFonts w:ascii="Times New Roman" w:hAnsi="Times New Roman"/>
+          <w:sz w:val="24"/>
+        </w:rPr>
+        <w:t xml:space="preserve"> folder</w:t>
+      </w:r>
+      <w:r>
+        <w:rPr>
+          <w:rFonts w:ascii="Times New Roman" w:hAnsi="Times New Roman"/>
+          <w:sz w:val="24"/>
+        </w:rPr>
+        <w:t xml:space="preserve">. The link of </w:t>
+      </w:r>
+      <w:proofErr w:type="spellStart"/>
+      <w:r>
+        <w:rPr>
+          <w:rFonts w:ascii="Times New Roman" w:hAnsi="Times New Roman"/>
+          <w:sz w:val="24"/>
+        </w:rPr>
+        <w:t>github</w:t>
+      </w:r>
+      <w:proofErr w:type="spellEnd"/>
+      <w:r>
+        <w:rPr>
+          <w:rFonts w:ascii="Times New Roman" w:hAnsi="Times New Roman"/>
+          <w:sz w:val="24"/>
+        </w:rPr>
+        <w:t xml:space="preserve"> where the file is uploaded is given at the end of the report.</w:t>
+      </w:r>
+    </w:p>
+    <w:p>
+      <w:pPr>
+        <w:rPr>
+          <w:rFonts w:ascii="Times New Roman" w:hAnsi="Times New Roman"/>
+        </w:rPr>
+      </w:pPr>
+    </w:p>
+    <w:p>
+      <w:pPr>
+        <w:rPr>
+          <w:rFonts w:ascii="Times New Roman" w:hAnsi="Times New Roman"/>
+        </w:rPr>
+      </w:pPr>
+    </w:p>
+    <w:p>
+      <w:pPr>
+        <w:rPr>
+          <w:rFonts w:ascii="Times New Roman" w:hAnsi="Times New Roman"/>
+        </w:rPr>
+      </w:pPr>
+    </w:p>
+    <w:p>
+      <w:pPr>
+        <w:rPr>
+          <w:rFonts w:ascii="Times New Roman" w:hAnsi="Times New Roman"/>
+        </w:rPr>
+      </w:pPr>
+    </w:p>
     <w:p>
       <w:pPr>
         <w:pStyle w:val="Heading1"/>
@@ -16948,23 +17824,7 @@
             <w:rFonts w:ascii="Times New Roman" w:hAnsi="Times New Roman"/>
             <w:sz w:val="24"/>
           </w:rPr>
-          <w:t>https://github.com/sujina8/Smar</w:t>
-        </w:r>
-        <w:r>
-          <w:rPr>
-            <w:rStyle w:val="Hyperlink"/>
-            <w:rFonts w:ascii="Times New Roman" w:hAnsi="Times New Roman"/>
-            <w:sz w:val="24"/>
-          </w:rPr>
-          <w:t>t</w:t>
-        </w:r>
-        <w:r>
-          <w:rPr>
-            <w:rStyle w:val="Hyperlink"/>
-            <w:rFonts w:ascii="Times New Roman" w:hAnsi="Times New Roman"/>
-            <w:sz w:val="24"/>
-          </w:rPr>
-          <w:t>Pantry.git</w:t>
+          <w:t>https://github.com/sujina8/SmartPantry.git</w:t>
         </w:r>
       </w:hyperlink>
     </w:p>
@@ -17002,13 +17862,13 @@
         </w:numPr>
         <w:spacing w:line="360" w:lineRule="auto"/>
         <w:rPr>
-          <w:rFonts w:ascii="Times New Roman" w:hAnsi="Times New Roman"/>
+          <w:rFonts w:ascii="Times New Roman" w:hAnsi="Times New Roman" w:cs="Times New Roman"/>
           <w:sz w:val="24"/>
         </w:rPr>
       </w:pPr>
       <w:r>
         <w:rPr>
-          <w:rFonts w:ascii="Times New Roman" w:hAnsi="Times New Roman"/>
+          <w:rFonts w:ascii="Times New Roman" w:hAnsi="Times New Roman" w:cs="Times New Roman"/>
           <w:sz w:val="24"/>
         </w:rPr>
         <w:t xml:space="preserve">Yeong, A. (2024). How Malaysians are battling food waste with surplus food. </w:t>
@@ -17016,7 +17876,7 @@
       <w:proofErr w:type="spellStart"/>
       <w:r>
         <w:rPr>
-          <w:rFonts w:ascii="Times New Roman" w:hAnsi="Times New Roman"/>
+          <w:rFonts w:ascii="Times New Roman" w:hAnsi="Times New Roman" w:cs="Times New Roman"/>
           <w:sz w:val="24"/>
         </w:rPr>
         <w:t>FairPlanet</w:t>
@@ -17024,7 +17884,7 @@
       <w:proofErr w:type="spellEnd"/>
       <w:r>
         <w:rPr>
-          <w:rFonts w:ascii="Times New Roman" w:hAnsi="Times New Roman"/>
+          <w:rFonts w:ascii="Times New Roman" w:hAnsi="Times New Roman" w:cs="Times New Roman"/>
           <w:sz w:val="24"/>
         </w:rPr>
         <w:t xml:space="preserve">. </w:t>
@@ -17033,26 +17893,10 @@
         <w:r>
           <w:rPr>
             <w:rStyle w:val="Hyperlink"/>
-            <w:rFonts w:ascii="Times New Roman" w:hAnsi="Times New Roman"/>
+            <w:rFonts w:ascii="Times New Roman" w:hAnsi="Times New Roman" w:cs="Times New Roman"/>
             <w:sz w:val="24"/>
           </w:rPr>
-          <w:t>https://w</w:t>
-        </w:r>
-        <w:r>
-          <w:rPr>
-            <w:rStyle w:val="Hyperlink"/>
-            <w:rFonts w:ascii="Times New Roman" w:hAnsi="Times New Roman"/>
-            <w:sz w:val="24"/>
-          </w:rPr>
-          <w:t>w</w:t>
-        </w:r>
-        <w:r>
-          <w:rPr>
-            <w:rStyle w:val="Hyperlink"/>
-            <w:rFonts w:ascii="Times New Roman" w:hAnsi="Times New Roman"/>
-            <w:sz w:val="24"/>
-          </w:rPr>
-          <w:t>w.fairplanet.org/editors-pick/how-malaysians-are-battling-food-waste-with-surplus-food/</w:t>
+          <w:t>https://www.fairplanet.org/editors-pick/how-malaysians-are-battling-food-waste-with-surplus-food/</w:t>
         </w:r>
       </w:hyperlink>
     </w:p>
@@ -17065,20 +17909,20 @@
         </w:numPr>
         <w:spacing w:line="360" w:lineRule="auto"/>
         <w:rPr>
-          <w:rFonts w:ascii="Times New Roman" w:hAnsi="Times New Roman"/>
+          <w:rFonts w:ascii="Times New Roman" w:hAnsi="Times New Roman" w:cs="Times New Roman"/>
           <w:sz w:val="24"/>
         </w:rPr>
       </w:pPr>
       <w:r>
         <w:rPr>
-          <w:rFonts w:ascii="Times New Roman" w:hAnsi="Times New Roman"/>
+          <w:rFonts w:ascii="Times New Roman" w:hAnsi="Times New Roman" w:cs="Times New Roman"/>
           <w:sz w:val="24"/>
         </w:rPr>
         <w:t xml:space="preserve">United Nations. (2023). </w:t>
       </w:r>
       <w:r>
         <w:rPr>
-          <w:rFonts w:ascii="Times New Roman" w:hAnsi="Times New Roman"/>
+          <w:rFonts w:ascii="Times New Roman" w:hAnsi="Times New Roman" w:cs="Times New Roman"/>
           <w:i/>
           <w:iCs/>
           <w:sz w:val="24"/>
@@ -17087,7 +17931,7 @@
       </w:r>
       <w:r>
         <w:rPr>
-          <w:rFonts w:ascii="Times New Roman" w:hAnsi="Times New Roman"/>
+          <w:rFonts w:ascii="Times New Roman" w:hAnsi="Times New Roman" w:cs="Times New Roman"/>
           <w:sz w:val="24"/>
         </w:rPr>
         <w:t xml:space="preserve">. United Nations Department of Economic and Social Affairs. </w:t>
@@ -17096,7 +17940,7 @@
         <w:r>
           <w:rPr>
             <w:rStyle w:val="Hyperlink"/>
-            <w:rFonts w:ascii="Times New Roman" w:hAnsi="Times New Roman"/>
+            <w:rFonts w:ascii="Times New Roman" w:hAnsi="Times New Roman" w:cs="Times New Roman"/>
             <w:sz w:val="24"/>
           </w:rPr>
           <w:t>https://sdgs.un.org/goals/goal12</w:t>
@@ -17108,7 +17952,7 @@
         <w:pStyle w:val="ListParagraph"/>
         <w:spacing w:line="360" w:lineRule="auto"/>
         <w:rPr>
-          <w:rFonts w:ascii="Times New Roman" w:hAnsi="Times New Roman"/>
+          <w:rFonts w:ascii="Times New Roman" w:hAnsi="Times New Roman" w:cs="Times New Roman"/>
           <w:sz w:val="24"/>
         </w:rPr>
       </w:pPr>
@@ -18562,6 +19406,7 @@
   <w:style w:type="character" w:default="1" w:styleId="DefaultParagraphFont">
     <w:name w:val="Default Paragraph Font"/>
     <w:uiPriority w:val="1"/>
+    <w:semiHidden/>
     <w:unhideWhenUsed/>
   </w:style>
   <w:style w:type="table" w:default="1" w:styleId="TableNormal">

</xml_diff>